<commit_message>
Update features and model and api
</commit_message>
<xml_diff>
--- a/docs/Résumé2.docx
+++ b/docs/Résumé2.docx
@@ -16,6 +16,9 @@
     </w:p>
     <w:p>
       <w:r>
+        <w:rPr>
+          <w:noProof/>
+        </w:rPr>
         <w:drawing>
           <wp:inline distT="0" distB="0" distL="0" distR="0" wp14:anchorId="4C5E3FBB" wp14:editId="56BFC9D1">
             <wp:extent cx="3210373" cy="7544853"/>
@@ -134,6 +137,41 @@
     <w:p>
       <w:pPr>
         <w:pStyle w:val="Titre2"/>
+      </w:pPr>
+      <w:r>
+        <w:t>2.2 data/</w:t>
+      </w:r>
+    </w:p>
+    <w:p>
+      <w:pPr>
+        <w:pStyle w:val="Titre3"/>
+      </w:pPr>
+      <w:r>
+        <w:t>raw/</w:t>
+      </w:r>
+    </w:p>
+    <w:p>
+      <w:r>
+        <w:t>Contient les données brutes récupérées à chaque prédiction :</w:t>
+      </w:r>
+    </w:p>
+    <w:p>
+      <w:pPr>
+        <w:numPr>
+          <w:ilvl w:val="0"/>
+          <w:numId w:val="9"/>
+        </w:numPr>
+      </w:pPr>
+      <w:r>
+        <w:t>flight_raw.json → réponse brute AviationStack</w:t>
+      </w:r>
+    </w:p>
+    <w:p>
+      <w:pPr>
+        <w:numPr>
+          <w:ilvl w:val="0"/>
+          <w:numId w:val="9"/>
+        </w:numPr>
         <w:rPr>
           <w:lang w:val="en-GB"/>
         </w:rPr>
@@ -142,12 +180,28 @@
         <w:rPr>
           <w:lang w:val="en-GB"/>
         </w:rPr>
-        <w:t>2.2 data/</w:t>
+        <w:t>weather_raw.json → réponse brute OpenWeather</w:t>
       </w:r>
     </w:p>
     <w:p>
       <w:pPr>
         <w:pStyle w:val="Titre3"/>
+      </w:pPr>
+      <w:r>
+        <w:t>processed/</w:t>
+      </w:r>
+    </w:p>
+    <w:p>
+      <w:r>
+        <w:t>Contient les données transformées prêtes pour l’API :</w:t>
+      </w:r>
+    </w:p>
+    <w:p>
+      <w:pPr>
+        <w:numPr>
+          <w:ilvl w:val="0"/>
+          <w:numId w:val="10"/>
+        </w:numPr>
         <w:rPr>
           <w:lang w:val="en-GB"/>
         </w:rPr>
@@ -156,96 +210,21 @@
         <w:rPr>
           <w:lang w:val="en-GB"/>
         </w:rPr>
-        <w:t>raw/</w:t>
-      </w:r>
-    </w:p>
-    <w:p>
-      <w:r>
-        <w:t>Contient les données brutes récupérées à chaque prédiction :</w:t>
-      </w:r>
-    </w:p>
-    <w:p>
-      <w:pPr>
-        <w:numPr>
-          <w:ilvl w:val="0"/>
-          <w:numId w:val="9"/>
-        </w:numPr>
-      </w:pPr>
-      <w:r>
-        <w:t>flight_raw.json → réponse brute AviationStack</w:t>
-      </w:r>
-    </w:p>
-    <w:p>
-      <w:pPr>
-        <w:numPr>
-          <w:ilvl w:val="0"/>
-          <w:numId w:val="9"/>
-        </w:numPr>
+        <w:t>features_for_api.json → payload final envoyé à /predict</w:t>
+      </w:r>
+    </w:p>
+    <w:p>
+      <w:pPr>
         <w:rPr>
           <w:lang w:val="en-GB"/>
         </w:rPr>
       </w:pPr>
-      <w:r>
-        <w:rPr>
-          <w:lang w:val="en-GB"/>
-        </w:rPr>
-        <w:t>weather_raw.json → réponse brute OpenWeather</w:t>
-      </w:r>
     </w:p>
     <w:p>
       <w:pPr>
         <w:pStyle w:val="Titre3"/>
-        <w:rPr>
-          <w:lang w:val="en-GB"/>
-        </w:rPr>
-      </w:pPr>
-      <w:r>
-        <w:rPr>
-          <w:lang w:val="en-GB"/>
-        </w:rPr>
-        <w:t>processed/</w:t>
-      </w:r>
-    </w:p>
-    <w:p>
-      <w:r>
-        <w:t>Contient les données transformées prêtes pour l’API :</w:t>
-      </w:r>
-    </w:p>
-    <w:p>
-      <w:pPr>
-        <w:numPr>
-          <w:ilvl w:val="0"/>
-          <w:numId w:val="10"/>
-        </w:numPr>
-        <w:rPr>
-          <w:lang w:val="en-GB"/>
-        </w:rPr>
-      </w:pPr>
-      <w:r>
-        <w:rPr>
-          <w:lang w:val="en-GB"/>
-        </w:rPr>
-        <w:t>features_for_api.json → payload final envoyé à /predict</w:t>
-      </w:r>
-    </w:p>
-    <w:p>
-      <w:pPr>
-        <w:rPr>
-          <w:lang w:val="en-GB"/>
-        </w:rPr>
-      </w:pPr>
-    </w:p>
-    <w:p>
-      <w:pPr>
-        <w:pStyle w:val="Titre3"/>
-        <w:rPr>
-          <w:lang w:val="en-GB"/>
-        </w:rPr>
-      </w:pPr>
-      <w:r>
-        <w:rPr>
-          <w:lang w:val="en-GB"/>
-        </w:rPr>
+      </w:pPr>
+      <w:r>
         <w:t>models/</w:t>
       </w:r>
     </w:p>
@@ -494,16 +473,36 @@
       </w:r>
     </w:p>
     <w:p>
-      <w:r>
+      <w:pPr>
+        <w:rPr>
+          <w:lang w:val="en-GB"/>
+        </w:rPr>
+      </w:pPr>
+      <w:r>
+        <w:rPr>
+          <w:lang w:val="en-GB"/>
+        </w:rPr>
         <w:t>Retourne { "predicted_delay": X }</w:t>
       </w:r>
     </w:p>
-    <w:p/>
+    <w:p>
+      <w:pPr>
+        <w:rPr>
+          <w:lang w:val="en-GB"/>
+        </w:rPr>
+      </w:pPr>
+    </w:p>
     <w:p>
       <w:pPr>
         <w:pStyle w:val="Titre3"/>
-      </w:pPr>
-      <w:r>
+        <w:rPr>
+          <w:lang w:val="en-GB"/>
+        </w:rPr>
+      </w:pPr>
+      <w:r>
+        <w:rPr>
+          <w:lang w:val="en-GB"/>
+        </w:rPr>
         <w:t>schemas.py</w:t>
       </w:r>
     </w:p>
@@ -1226,14 +1225,8 @@
       </w:r>
     </w:p>
     <w:p>
-      <w:pPr>
-        <w:pStyle w:val="Titre2"/>
-      </w:pPr>
-      <w:r>
-        <w:t xml:space="preserve">3.1 </w:t>
-      </w:r>
-      <w:r>
-        <w:t>Mise à jour du fichier .env</w:t>
+      <w:r>
+        <w:t>Avant tout il faut activer l’environnement virtuelle :</w:t>
       </w:r>
     </w:p>
     <w:p>
@@ -1253,6 +1246,143 @@
     </w:p>
     <w:p>
       <w:r>
+        <w:t>Code</w:t>
+      </w:r>
+    </w:p>
+    <w:p>
+      <w:r>
+        <w:t>source venv/bin/activate</w:t>
+      </w:r>
+    </w:p>
+    <w:p>
+      <w:pPr>
+        <w:rPr>
+          <w:b/>
+          <w:bCs/>
+        </w:rPr>
+      </w:pPr>
+      <w:r>
+        <w:rPr>
+          <w:b/>
+          <w:bCs/>
+        </w:rPr>
+        <w:t>Pourquoi :</w:t>
+      </w:r>
+    </w:p>
+    <w:p>
+      <w:pPr>
+        <w:numPr>
+          <w:ilvl w:val="0"/>
+          <w:numId w:val="27"/>
+        </w:numPr>
+      </w:pPr>
+      <w:r>
+        <w:t>Charge toutes les dépendances Python du projet</w:t>
+      </w:r>
+    </w:p>
+    <w:p>
+      <w:pPr>
+        <w:numPr>
+          <w:ilvl w:val="0"/>
+          <w:numId w:val="27"/>
+        </w:numPr>
+      </w:pPr>
+      <w:r>
+        <w:t>Garantit que FastAPI, pandas, sklearn, etc. sont disponibles</w:t>
+      </w:r>
+    </w:p>
+    <w:p>
+      <w:pPr>
+        <w:numPr>
+          <w:ilvl w:val="0"/>
+          <w:numId w:val="27"/>
+        </w:numPr>
+      </w:pPr>
+      <w:r>
+        <w:t>Évite les conflits avec les packages système</w:t>
+      </w:r>
+    </w:p>
+    <w:p>
+      <w:pPr>
+        <w:rPr>
+          <w:b/>
+          <w:bCs/>
+        </w:rPr>
+      </w:pPr>
+      <w:r>
+        <w:rPr>
+          <w:b/>
+          <w:bCs/>
+        </w:rPr>
+        <w:t>Fichiers concernés :</w:t>
+      </w:r>
+    </w:p>
+    <w:p>
+      <w:pPr>
+        <w:numPr>
+          <w:ilvl w:val="0"/>
+          <w:numId w:val="28"/>
+        </w:numPr>
+      </w:pPr>
+      <w:r>
+        <w:t>venv/</w:t>
+      </w:r>
+    </w:p>
+    <w:p>
+      <w:pPr>
+        <w:numPr>
+          <w:ilvl w:val="0"/>
+          <w:numId w:val="28"/>
+        </w:numPr>
+      </w:pPr>
+      <w:r>
+        <w:t>requirements.txt (installé dans le venv)</w:t>
+      </w:r>
+    </w:p>
+    <w:p/>
+    <w:p>
+      <w:r>
+        <w:t>Puis il faut a</w:t>
+      </w:r>
+      <w:r>
+        <w:t>ller dans le dossier du projet</w:t>
+      </w:r>
+      <w:r>
+        <w:t xml:space="preserve"> : </w:t>
+      </w:r>
+      <w:r>
+        <w:t>cd ~/Flight-delay-prediction</w:t>
+      </w:r>
+    </w:p>
+    <w:p/>
+    <w:p>
+      <w:pPr>
+        <w:pStyle w:val="Titre2"/>
+      </w:pPr>
+      <w:r>
+        <w:t xml:space="preserve">3.1 </w:t>
+      </w:r>
+      <w:r>
+        <w:t>Mise à jour du fichier .env</w:t>
+      </w:r>
+    </w:p>
+    <w:p>
+      <w:pPr>
+        <w:rPr>
+          <w:b/>
+          <w:bCs/>
+        </w:rPr>
+      </w:pPr>
+      <w:r>
+        <w:rPr>
+          <w:b/>
+          <w:bCs/>
+        </w:rPr>
+        <w:t>Commande :</w:t>
+      </w:r>
+    </w:p>
+    <w:p>
+      <w:r>
         <w:rPr>
           <w:i/>
           <w:iCs/>
@@ -1322,6 +1452,7 @@
           <w:b/>
           <w:bCs/>
         </w:rPr>
+        <w:lastRenderedPageBreak/>
         <w:t>Fichiers concernés :</w:t>
       </w:r>
     </w:p>
@@ -1392,7 +1523,13 @@
     </w:p>
     <w:p>
       <w:r>
-        <w:t>uvicorn src.api.main:app --host 0.0.0.0 --port 8000 --reload</w:t>
+        <w:t xml:space="preserve">python -m uvicorn src.api.main:app --host 0.0.0.0 --port 8000 </w:t>
+      </w:r>
+      <w:r>
+        <w:t>–</w:t>
+      </w:r>
+      <w:r>
+        <w:t>reload</w:t>
       </w:r>
     </w:p>
     <w:p>
@@ -1411,8 +1548,36 @@
       </w:r>
     </w:p>
     <w:p>
-      <w:r>
-        <w:t>Démarre le serveur FastAPI qui expose l’endpoint /predict. Sans cette API, aucune prédiction n’est possible.</w:t>
+      <w:pPr>
+        <w:numPr>
+          <w:ilvl w:val="0"/>
+          <w:numId w:val="29"/>
+        </w:numPr>
+      </w:pPr>
+      <w:r>
+        <w:t>Démarre le serveur FastAPI</w:t>
+      </w:r>
+    </w:p>
+    <w:p>
+      <w:pPr>
+        <w:numPr>
+          <w:ilvl w:val="0"/>
+          <w:numId w:val="29"/>
+        </w:numPr>
+      </w:pPr>
+      <w:r>
+        <w:t>Expose l’endpoint /predict</w:t>
+      </w:r>
+    </w:p>
+    <w:p>
+      <w:pPr>
+        <w:numPr>
+          <w:ilvl w:val="0"/>
+          <w:numId w:val="29"/>
+        </w:numPr>
+      </w:pPr>
+      <w:r>
+        <w:t>Charge le modèle ML en mémoire</w:t>
       </w:r>
     </w:p>
     <w:p>
@@ -1427,41 +1592,78 @@
           <w:b/>
           <w:bCs/>
         </w:rPr>
-        <w:t>Ce que ça fait :</w:t>
-      </w:r>
-    </w:p>
-    <w:p>
-      <w:pPr>
-        <w:numPr>
-          <w:ilvl w:val="0"/>
-          <w:numId w:val="19"/>
-        </w:numPr>
-      </w:pPr>
-      <w:r>
-        <w:t>Charge le modèle ML via src/ml/model.py</w:t>
-      </w:r>
-    </w:p>
-    <w:p>
-      <w:pPr>
-        <w:numPr>
-          <w:ilvl w:val="0"/>
-          <w:numId w:val="19"/>
-        </w:numPr>
-      </w:pPr>
-      <w:r>
-        <w:t>Initialise les routes définies dans src/api/main.py</w:t>
-      </w:r>
-    </w:p>
-    <w:p>
-      <w:pPr>
-        <w:numPr>
-          <w:ilvl w:val="0"/>
-          <w:numId w:val="19"/>
-        </w:numPr>
-      </w:pPr>
-      <w:r>
-        <w:lastRenderedPageBreak/>
-        <w:t>Active la fonction de prédiction predict_delay() dans src/api/predict.py</w:t>
+        <w:t>Ce que ça déclenche :</w:t>
+      </w:r>
+    </w:p>
+    <w:p>
+      <w:pPr>
+        <w:numPr>
+          <w:ilvl w:val="0"/>
+          <w:numId w:val="30"/>
+        </w:numPr>
+      </w:pPr>
+      <w:r>
+        <w:t>src/api/main.py → initialise FastAPI</w:t>
+      </w:r>
+    </w:p>
+    <w:p>
+      <w:pPr>
+        <w:numPr>
+          <w:ilvl w:val="0"/>
+          <w:numId w:val="30"/>
+        </w:numPr>
+      </w:pPr>
+      <w:r>
+        <w:t>src/api/predict.py → expose la route /predict</w:t>
+      </w:r>
+    </w:p>
+    <w:p>
+      <w:pPr>
+        <w:numPr>
+          <w:ilvl w:val="0"/>
+          <w:numId w:val="30"/>
+        </w:numPr>
+      </w:pPr>
+      <w:r>
+        <w:t>src/api/schemas.py → valide les inputs</w:t>
+      </w:r>
+    </w:p>
+    <w:p>
+      <w:pPr>
+        <w:numPr>
+          <w:ilvl w:val="0"/>
+          <w:numId w:val="30"/>
+        </w:numPr>
+        <w:rPr>
+          <w:lang w:val="en-GB"/>
+        </w:rPr>
+      </w:pPr>
+      <w:r>
+        <w:rPr>
+          <w:lang w:val="en-GB"/>
+        </w:rPr>
+        <w:t>src/ml/model.py → charge flight_delay_model.pkl</w:t>
+      </w:r>
+    </w:p>
+    <w:p>
+      <w:pPr>
+        <w:numPr>
+          <w:ilvl w:val="0"/>
+          <w:numId w:val="30"/>
+        </w:numPr>
+      </w:pPr>
+      <w:r>
+        <w:t>data/models/flight_delay_model.pkl → modèle utilisé pour prédire</w:t>
+      </w:r>
+    </w:p>
+    <w:p/>
+    <w:p/>
+    <w:p>
+      <w:pPr>
+        <w:pStyle w:val="Titre2"/>
+      </w:pPr>
+      <w:r>
+        <w:t>3.3. Lancer une prediction</w:t>
       </w:r>
     </w:p>
     <w:p>
@@ -1476,89 +1678,17 @@
           <w:b/>
           <w:bCs/>
         </w:rPr>
-        <w:t>Fichiers concernés :</w:t>
-      </w:r>
-    </w:p>
-    <w:p>
-      <w:pPr>
-        <w:numPr>
-          <w:ilvl w:val="0"/>
-          <w:numId w:val="20"/>
-        </w:numPr>
-      </w:pPr>
-      <w:r>
-        <w:t>src/api/main.py</w:t>
-      </w:r>
-    </w:p>
-    <w:p>
-      <w:pPr>
-        <w:numPr>
-          <w:ilvl w:val="0"/>
-          <w:numId w:val="20"/>
-        </w:numPr>
-      </w:pPr>
-      <w:r>
-        <w:t>src/api/predict.py</w:t>
-      </w:r>
-    </w:p>
-    <w:p>
-      <w:pPr>
-        <w:numPr>
-          <w:ilvl w:val="0"/>
-          <w:numId w:val="20"/>
-        </w:numPr>
-      </w:pPr>
-      <w:r>
-        <w:t>src/api/schemas.py</w:t>
-      </w:r>
-    </w:p>
-    <w:p>
-      <w:pPr>
-        <w:numPr>
-          <w:ilvl w:val="0"/>
-          <w:numId w:val="20"/>
-        </w:numPr>
-      </w:pPr>
-      <w:r>
-        <w:t>src/ml/model.py</w:t>
-      </w:r>
-    </w:p>
-    <w:p>
-      <w:pPr>
-        <w:numPr>
-          <w:ilvl w:val="0"/>
-          <w:numId w:val="20"/>
-        </w:numPr>
-        <w:rPr>
-          <w:lang w:val="en-GB"/>
-        </w:rPr>
-      </w:pPr>
-      <w:r>
-        <w:rPr>
-          <w:lang w:val="en-GB"/>
-        </w:rPr>
-        <w:t>data/models/flight_delay_model.pkl</w:t>
-      </w:r>
-    </w:p>
-    <w:p>
-      <w:pPr>
-        <w:rPr>
-          <w:lang w:val="en-GB"/>
-        </w:rPr>
-      </w:pPr>
-    </w:p>
-    <w:p>
-      <w:pPr>
-        <w:pStyle w:val="Titre2"/>
-      </w:pPr>
-      <w:r>
-        <w:t xml:space="preserve">3.3. </w:t>
-      </w:r>
-      <w:r>
-        <w:t xml:space="preserve">Lancer une </w:t>
-      </w:r>
-      <w:r>
-        <w:t>prediction</w:t>
+        <w:t>Commande :</w:t>
+      </w:r>
+    </w:p>
+    <w:p>
+      <w:r>
+        <w:t>Code</w:t>
+      </w:r>
+    </w:p>
+    <w:p>
+      <w:r>
+        <w:t>python -m scripts.run_prediction</w:t>
       </w:r>
     </w:p>
     <w:p>
@@ -1573,17 +1703,12 @@
           <w:b/>
           <w:bCs/>
         </w:rPr>
-        <w:t>Commande :</w:t>
-      </w:r>
-    </w:p>
-    <w:p>
-      <w:r>
-        <w:t>Code</w:t>
-      </w:r>
-    </w:p>
-    <w:p>
-      <w:r>
-        <w:t>python -m scripts.run_prediction</w:t>
+        <w:t>Pourquoi :</w:t>
+      </w:r>
+    </w:p>
+    <w:p>
+      <w:r>
+        <w:t>Exécute le pipeline complet de prédiction : récupération des données → transformation → appel API → résultat.</w:t>
       </w:r>
     </w:p>
     <w:p>
@@ -1598,12 +1723,85 @@
           <w:b/>
           <w:bCs/>
         </w:rPr>
-        <w:t>Pourquoi :</w:t>
-      </w:r>
-    </w:p>
-    <w:p>
-      <w:r>
-        <w:t>Exécute le pipeline complet de prédiction : récupération des données → transformation → appel API → résultat.</w:t>
+        <w:t>Ce que ça fait :</w:t>
+      </w:r>
+    </w:p>
+    <w:p>
+      <w:pPr>
+        <w:numPr>
+          <w:ilvl w:val="0"/>
+          <w:numId w:val="21"/>
+        </w:numPr>
+      </w:pPr>
+      <w:r>
+        <w:lastRenderedPageBreak/>
+        <w:t>Récupère un vol réel depuis AviationStack → via src/collectors/prediction_collector.py</w:t>
+      </w:r>
+    </w:p>
+    <w:p>
+      <w:pPr>
+        <w:numPr>
+          <w:ilvl w:val="0"/>
+          <w:numId w:val="21"/>
+        </w:numPr>
+      </w:pPr>
+      <w:r>
+        <w:t>Récupère la météo de Paris → via prediction_collector.py</w:t>
+      </w:r>
+    </w:p>
+    <w:p>
+      <w:pPr>
+        <w:numPr>
+          <w:ilvl w:val="0"/>
+          <w:numId w:val="21"/>
+        </w:numPr>
+      </w:pPr>
+      <w:r>
+        <w:t>Sauvegarde les données brutes → data/raw/flight_raw.json → data/raw/weather_raw.json</w:t>
+      </w:r>
+    </w:p>
+    <w:p>
+      <w:pPr>
+        <w:numPr>
+          <w:ilvl w:val="0"/>
+          <w:numId w:val="21"/>
+        </w:numPr>
+      </w:pPr>
+      <w:r>
+        <w:t>Transforme les données en features → via src/utils/transformers.py</w:t>
+      </w:r>
+    </w:p>
+    <w:p>
+      <w:pPr>
+        <w:numPr>
+          <w:ilvl w:val="0"/>
+          <w:numId w:val="21"/>
+        </w:numPr>
+      </w:pPr>
+      <w:r>
+        <w:t>Sauvegarde les features transformées → data/processed/features_for_api.json</w:t>
+      </w:r>
+    </w:p>
+    <w:p>
+      <w:pPr>
+        <w:numPr>
+          <w:ilvl w:val="0"/>
+          <w:numId w:val="21"/>
+        </w:numPr>
+      </w:pPr>
+      <w:r>
+        <w:t>Envoie les features à l’API /predict</w:t>
+      </w:r>
+    </w:p>
+    <w:p>
+      <w:pPr>
+        <w:numPr>
+          <w:ilvl w:val="0"/>
+          <w:numId w:val="21"/>
+        </w:numPr>
+      </w:pPr>
+      <w:r>
+        <w:t>Affiche la prédiction corrigée (jamais négative)</w:t>
       </w:r>
     </w:p>
     <w:p>
@@ -1618,84 +1816,94 @@
           <w:b/>
           <w:bCs/>
         </w:rPr>
-        <w:t>Ce que ça fait :</w:t>
-      </w:r>
-    </w:p>
-    <w:p>
-      <w:pPr>
-        <w:numPr>
-          <w:ilvl w:val="0"/>
-          <w:numId w:val="21"/>
-        </w:numPr>
-      </w:pPr>
-      <w:r>
-        <w:t>Récupère un vol réel depuis AviationStack → via src/collectors/prediction_collector.py</w:t>
-      </w:r>
-    </w:p>
-    <w:p>
-      <w:pPr>
-        <w:numPr>
-          <w:ilvl w:val="0"/>
-          <w:numId w:val="21"/>
-        </w:numPr>
-      </w:pPr>
-      <w:r>
-        <w:t>Récupère la météo de Paris → via prediction_collector.py</w:t>
-      </w:r>
-    </w:p>
-    <w:p>
-      <w:pPr>
-        <w:numPr>
-          <w:ilvl w:val="0"/>
-          <w:numId w:val="21"/>
-        </w:numPr>
-      </w:pPr>
-      <w:r>
-        <w:t>Sauvegarde les données brutes → data/raw/flight_raw.json → data/raw/weather_raw.json</w:t>
-      </w:r>
-    </w:p>
-    <w:p>
-      <w:pPr>
-        <w:numPr>
-          <w:ilvl w:val="0"/>
-          <w:numId w:val="21"/>
-        </w:numPr>
-      </w:pPr>
-      <w:r>
-        <w:t>Transforme les données en features → via src/utils/transformers.py</w:t>
-      </w:r>
-    </w:p>
-    <w:p>
-      <w:pPr>
-        <w:numPr>
-          <w:ilvl w:val="0"/>
-          <w:numId w:val="21"/>
-        </w:numPr>
-      </w:pPr>
-      <w:r>
-        <w:t>Sauvegarde les features transformées → data/processed/features_for_api.json</w:t>
-      </w:r>
-    </w:p>
-    <w:p>
-      <w:pPr>
-        <w:numPr>
-          <w:ilvl w:val="0"/>
-          <w:numId w:val="21"/>
-        </w:numPr>
-      </w:pPr>
-      <w:r>
-        <w:t>Envoie les features à l’API /predict</w:t>
-      </w:r>
-    </w:p>
-    <w:p>
-      <w:pPr>
-        <w:numPr>
-          <w:ilvl w:val="0"/>
-          <w:numId w:val="21"/>
-        </w:numPr>
-      </w:pPr>
-      <w:r>
-        <w:t>Affiche la prédiction corrigée (jamais négative)</w:t>
+        <w:t>Fichiers concernés :</w:t>
+      </w:r>
+    </w:p>
+    <w:p>
+      <w:pPr>
+        <w:numPr>
+          <w:ilvl w:val="0"/>
+          <w:numId w:val="22"/>
+        </w:numPr>
+      </w:pPr>
+      <w:r>
+        <w:t>scripts/run_prediction.py</w:t>
+      </w:r>
+    </w:p>
+    <w:p>
+      <w:pPr>
+        <w:numPr>
+          <w:ilvl w:val="0"/>
+          <w:numId w:val="22"/>
+        </w:numPr>
+      </w:pPr>
+      <w:r>
+        <w:t>src/collectors/prediction_collector.py</w:t>
+      </w:r>
+    </w:p>
+    <w:p>
+      <w:pPr>
+        <w:numPr>
+          <w:ilvl w:val="0"/>
+          <w:numId w:val="22"/>
+        </w:numPr>
+      </w:pPr>
+      <w:r>
+        <w:t>src/utils/transformers.py</w:t>
+      </w:r>
+    </w:p>
+    <w:p>
+      <w:pPr>
+        <w:numPr>
+          <w:ilvl w:val="0"/>
+          <w:numId w:val="22"/>
+        </w:numPr>
+      </w:pPr>
+      <w:r>
+        <w:t>src/utils/storage.py</w:t>
+      </w:r>
+    </w:p>
+    <w:p>
+      <w:pPr>
+        <w:numPr>
+          <w:ilvl w:val="0"/>
+          <w:numId w:val="22"/>
+        </w:numPr>
+      </w:pPr>
+      <w:r>
+        <w:t>.env (API_URL)</w:t>
+      </w:r>
+    </w:p>
+    <w:p>
+      <w:pPr>
+        <w:numPr>
+          <w:ilvl w:val="0"/>
+          <w:numId w:val="22"/>
+        </w:numPr>
+        <w:rPr>
+          <w:lang w:val="en-GB"/>
+        </w:rPr>
+      </w:pPr>
+      <w:r>
+        <w:rPr>
+          <w:lang w:val="en-GB"/>
+        </w:rPr>
+        <w:t>src/api/predict.py (appel API)</w:t>
+      </w:r>
+    </w:p>
+    <w:p>
+      <w:pPr>
+        <w:rPr>
+          <w:lang w:val="en-GB"/>
+        </w:rPr>
+      </w:pPr>
+    </w:p>
+    <w:p>
+      <w:pPr>
+        <w:pStyle w:val="Titre2"/>
+      </w:pPr>
+      <w:r>
+        <w:t>3.4. Lancer la collecte historique</w:t>
       </w:r>
     </w:p>
     <w:p>
@@ -1710,107 +1918,17 @@
           <w:b/>
           <w:bCs/>
         </w:rPr>
-        <w:t>Fichiers concernés :</w:t>
-      </w:r>
-    </w:p>
-    <w:p>
-      <w:pPr>
-        <w:numPr>
-          <w:ilvl w:val="0"/>
-          <w:numId w:val="22"/>
-        </w:numPr>
-      </w:pPr>
-      <w:r>
-        <w:t>scripts/run_prediction.py</w:t>
-      </w:r>
-    </w:p>
-    <w:p>
-      <w:pPr>
-        <w:numPr>
-          <w:ilvl w:val="0"/>
-          <w:numId w:val="22"/>
-        </w:numPr>
-      </w:pPr>
-      <w:r>
-        <w:t>src/collectors/prediction_collector.py</w:t>
-      </w:r>
-    </w:p>
-    <w:p>
-      <w:pPr>
-        <w:numPr>
-          <w:ilvl w:val="0"/>
-          <w:numId w:val="22"/>
-        </w:numPr>
-      </w:pPr>
-      <w:r>
-        <w:t>src/utils/transformers.py</w:t>
-      </w:r>
-    </w:p>
-    <w:p>
-      <w:pPr>
-        <w:numPr>
-          <w:ilvl w:val="0"/>
-          <w:numId w:val="22"/>
-        </w:numPr>
-      </w:pPr>
-      <w:r>
-        <w:lastRenderedPageBreak/>
-        <w:t>src/utils/storage.py</w:t>
-      </w:r>
-    </w:p>
-    <w:p>
-      <w:pPr>
-        <w:numPr>
-          <w:ilvl w:val="0"/>
-          <w:numId w:val="22"/>
-        </w:numPr>
-      </w:pPr>
-      <w:r>
-        <w:t>.env (API_URL)</w:t>
-      </w:r>
-    </w:p>
-    <w:p>
-      <w:pPr>
-        <w:numPr>
-          <w:ilvl w:val="0"/>
-          <w:numId w:val="22"/>
-        </w:numPr>
-        <w:rPr>
-          <w:lang w:val="en-GB"/>
-        </w:rPr>
-      </w:pPr>
-      <w:r>
-        <w:rPr>
-          <w:lang w:val="en-GB"/>
-        </w:rPr>
-        <w:t>src/api/predict.py (appel API)</w:t>
-      </w:r>
-    </w:p>
-    <w:p>
-      <w:pPr>
-        <w:rPr>
-          <w:lang w:val="en-GB"/>
-        </w:rPr>
-      </w:pPr>
-    </w:p>
-    <w:p>
-      <w:pPr>
-        <w:pStyle w:val="Titre2"/>
-        <w:rPr>
-          <w:lang w:val="en-GB"/>
-        </w:rPr>
-      </w:pPr>
-      <w:r>
-        <w:rPr>
-          <w:lang w:val="en-GB"/>
-        </w:rPr>
-        <w:t xml:space="preserve">3.4. </w:t>
-      </w:r>
-      <w:r>
-        <w:rPr>
-          <w:lang w:val="en-GB"/>
-        </w:rPr>
-        <w:t>Lancer la collecte historique</w:t>
+        <w:t>Commande :</w:t>
+      </w:r>
+    </w:p>
+    <w:p>
+      <w:r>
+        <w:t>Code</w:t>
+      </w:r>
+    </w:p>
+    <w:p>
+      <w:r>
+        <w:t>python -m scripts.run_collectors</w:t>
       </w:r>
     </w:p>
     <w:p>
@@ -1825,17 +1943,12 @@
           <w:b/>
           <w:bCs/>
         </w:rPr>
-        <w:t>Commande :</w:t>
-      </w:r>
-    </w:p>
-    <w:p>
-      <w:r>
-        <w:t>Code</w:t>
-      </w:r>
-    </w:p>
-    <w:p>
-      <w:r>
-        <w:t>python -m scripts.run_collectors</w:t>
+        <w:t>Pourquoi :</w:t>
+      </w:r>
+    </w:p>
+    <w:p>
+      <w:r>
+        <w:t>Collecte des données réelles (vols + météo) pour enrichir le dataset d’entraînement.</w:t>
       </w:r>
     </w:p>
     <w:p>
@@ -1850,12 +1963,40 @@
           <w:b/>
           <w:bCs/>
         </w:rPr>
-        <w:t>Pourquoi :</w:t>
-      </w:r>
-    </w:p>
-    <w:p>
-      <w:r>
-        <w:t>Collecte des données réelles (vols + météo) pour enrichir le dataset d’entraînement.</w:t>
+        <w:t>Ce que ça fait :</w:t>
+      </w:r>
+    </w:p>
+    <w:p>
+      <w:pPr>
+        <w:numPr>
+          <w:ilvl w:val="0"/>
+          <w:numId w:val="23"/>
+        </w:numPr>
+      </w:pPr>
+      <w:r>
+        <w:t>Récupère les vols du jour (uniquement ceux “landed”)</w:t>
+      </w:r>
+    </w:p>
+    <w:p>
+      <w:pPr>
+        <w:numPr>
+          <w:ilvl w:val="0"/>
+          <w:numId w:val="23"/>
+        </w:numPr>
+      </w:pPr>
+      <w:r>
+        <w:t>Récupère la météo de plusieurs villes</w:t>
+      </w:r>
+    </w:p>
+    <w:p>
+      <w:pPr>
+        <w:numPr>
+          <w:ilvl w:val="0"/>
+          <w:numId w:val="23"/>
+        </w:numPr>
+      </w:pPr>
+      <w:r>
+        <w:t>Stocke tout dans MongoDB (base historique)</w:t>
       </w:r>
     </w:p>
     <w:p>
@@ -1870,40 +2011,68 @@
           <w:b/>
           <w:bCs/>
         </w:rPr>
-        <w:t>Ce que ça fait :</w:t>
-      </w:r>
-    </w:p>
-    <w:p>
-      <w:pPr>
-        <w:numPr>
-          <w:ilvl w:val="0"/>
-          <w:numId w:val="23"/>
-        </w:numPr>
-      </w:pPr>
-      <w:r>
-        <w:t>Récupère les vols du jour (uniquement ceux “landed”)</w:t>
-      </w:r>
-    </w:p>
-    <w:p>
-      <w:pPr>
-        <w:numPr>
-          <w:ilvl w:val="0"/>
-          <w:numId w:val="23"/>
-        </w:numPr>
-      </w:pPr>
-      <w:r>
-        <w:t>Récupère la météo de plusieurs villes</w:t>
-      </w:r>
-    </w:p>
-    <w:p>
-      <w:pPr>
-        <w:numPr>
-          <w:ilvl w:val="0"/>
-          <w:numId w:val="23"/>
-        </w:numPr>
-      </w:pPr>
-      <w:r>
-        <w:t>Stocke tout dans MongoDB (base historique)</w:t>
+        <w:t>Fichiers concernés :</w:t>
+      </w:r>
+    </w:p>
+    <w:p>
+      <w:pPr>
+        <w:numPr>
+          <w:ilvl w:val="0"/>
+          <w:numId w:val="24"/>
+        </w:numPr>
+      </w:pPr>
+      <w:r>
+        <w:t>scripts/run_collectors.py</w:t>
+      </w:r>
+    </w:p>
+    <w:p>
+      <w:pPr>
+        <w:numPr>
+          <w:ilvl w:val="0"/>
+          <w:numId w:val="24"/>
+        </w:numPr>
+      </w:pPr>
+      <w:r>
+        <w:lastRenderedPageBreak/>
+        <w:t>src/collectors/historical_collector.py</w:t>
+      </w:r>
+    </w:p>
+    <w:p>
+      <w:pPr>
+        <w:numPr>
+          <w:ilvl w:val="0"/>
+          <w:numId w:val="24"/>
+        </w:numPr>
+      </w:pPr>
+      <w:r>
+        <w:t>.env (clés API + MongoDB URI)</w:t>
+      </w:r>
+    </w:p>
+    <w:p>
+      <w:pPr>
+        <w:rPr>
+          <w:lang w:val="en-GB"/>
+        </w:rPr>
+      </w:pPr>
+    </w:p>
+    <w:p>
+      <w:pPr>
+        <w:pStyle w:val="Titre2"/>
+        <w:rPr>
+          <w:lang w:val="en-GB"/>
+        </w:rPr>
+      </w:pPr>
+      <w:r>
+        <w:rPr>
+          <w:lang w:val="en-GB"/>
+        </w:rPr>
+        <w:t xml:space="preserve">3.5. </w:t>
+      </w:r>
+      <w:r>
+        <w:rPr>
+          <w:lang w:val="en-GB"/>
+        </w:rPr>
+        <w:t>Réentraîner le modèle ML</w:t>
       </w:r>
     </w:p>
     <w:p>
@@ -1918,67 +2087,17 @@
           <w:b/>
           <w:bCs/>
         </w:rPr>
-        <w:t>Fichiers concernés :</w:t>
-      </w:r>
-    </w:p>
-    <w:p>
-      <w:pPr>
-        <w:numPr>
-          <w:ilvl w:val="0"/>
-          <w:numId w:val="24"/>
-        </w:numPr>
-      </w:pPr>
-      <w:r>
-        <w:t>scripts/run_collectors.py</w:t>
-      </w:r>
-    </w:p>
-    <w:p>
-      <w:pPr>
-        <w:numPr>
-          <w:ilvl w:val="0"/>
-          <w:numId w:val="24"/>
-        </w:numPr>
-      </w:pPr>
-      <w:r>
-        <w:t>src/collectors/historical_collector.py</w:t>
-      </w:r>
-    </w:p>
-    <w:p>
-      <w:pPr>
-        <w:numPr>
-          <w:ilvl w:val="0"/>
-          <w:numId w:val="24"/>
-        </w:numPr>
-      </w:pPr>
-      <w:r>
-        <w:t>.env (clés API + MongoDB URI)</w:t>
-      </w:r>
-    </w:p>
-    <w:p>
-      <w:pPr>
-        <w:rPr>
-          <w:lang w:val="en-GB"/>
-        </w:rPr>
-      </w:pPr>
-    </w:p>
-    <w:p>
-      <w:pPr>
-        <w:pStyle w:val="Titre2"/>
-        <w:rPr>
-          <w:lang w:val="en-GB"/>
-        </w:rPr>
-      </w:pPr>
-      <w:r>
-        <w:rPr>
-          <w:lang w:val="en-GB"/>
-        </w:rPr>
-        <w:t xml:space="preserve">3.5. </w:t>
-      </w:r>
-      <w:r>
-        <w:rPr>
-          <w:lang w:val="en-GB"/>
-        </w:rPr>
-        <w:t>Réentraîner le modèle ML</w:t>
+        <w:t>Commande :</w:t>
+      </w:r>
+    </w:p>
+    <w:p>
+      <w:r>
+        <w:t>Code</w:t>
+      </w:r>
+    </w:p>
+    <w:p>
+      <w:r>
+        <w:t>python -m scripts.run_training</w:t>
       </w:r>
     </w:p>
     <w:p>
@@ -1993,17 +2112,12 @@
           <w:b/>
           <w:bCs/>
         </w:rPr>
-        <w:t>Commande :</w:t>
-      </w:r>
-    </w:p>
-    <w:p>
-      <w:r>
-        <w:t>Code</w:t>
-      </w:r>
-    </w:p>
-    <w:p>
-      <w:r>
-        <w:t>python -m scripts.run_training</w:t>
+        <w:t>Pourquoi :</w:t>
+      </w:r>
+    </w:p>
+    <w:p>
+      <w:r>
+        <w:t>Met à jour le modèle ML avec les nouvelles données collectées. Indispensable pour améliorer la précision au fil du temps.</w:t>
       </w:r>
     </w:p>
     <w:p>
@@ -2018,12 +2132,99 @@
           <w:b/>
           <w:bCs/>
         </w:rPr>
-        <w:t>Pourquoi :</w:t>
-      </w:r>
-    </w:p>
-    <w:p>
-      <w:r>
-        <w:t>Met à jour le modèle ML avec les nouvelles données collectées. Indispensable pour améliorer la précision au fil du temps.</w:t>
+        <w:t>Ce que ça fait :</w:t>
+      </w:r>
+    </w:p>
+    <w:p>
+      <w:pPr>
+        <w:numPr>
+          <w:ilvl w:val="0"/>
+          <w:numId w:val="25"/>
+        </w:numPr>
+      </w:pPr>
+      <w:r>
+        <w:t>Charge les données historiques depuis MongoDB</w:t>
+      </w:r>
+    </w:p>
+    <w:p>
+      <w:pPr>
+        <w:numPr>
+          <w:ilvl w:val="0"/>
+          <w:numId w:val="25"/>
+        </w:numPr>
+      </w:pPr>
+      <w:r>
+        <w:t>Transforme les données via src/ml/features.py</w:t>
+      </w:r>
+    </w:p>
+    <w:p>
+      <w:pPr>
+        <w:numPr>
+          <w:ilvl w:val="0"/>
+          <w:numId w:val="25"/>
+        </w:numPr>
+      </w:pPr>
+      <w:r>
+        <w:t>Construit le pipeline ML via src/ml/model.py</w:t>
+      </w:r>
+    </w:p>
+    <w:p>
+      <w:pPr>
+        <w:numPr>
+          <w:ilvl w:val="0"/>
+          <w:numId w:val="25"/>
+        </w:numPr>
+      </w:pPr>
+      <w:r>
+        <w:t>Entraîne le modèle</w:t>
+      </w:r>
+    </w:p>
+    <w:p>
+      <w:pPr>
+        <w:numPr>
+          <w:ilvl w:val="0"/>
+          <w:numId w:val="25"/>
+        </w:numPr>
+      </w:pPr>
+      <w:r>
+        <w:t>Évalue les performances</w:t>
+      </w:r>
+    </w:p>
+    <w:p>
+      <w:pPr>
+        <w:numPr>
+          <w:ilvl w:val="0"/>
+          <w:numId w:val="25"/>
+        </w:numPr>
+      </w:pPr>
+      <w:r>
+        <w:t>Sauvegarde le modèle final dans :</w:t>
+      </w:r>
+    </w:p>
+    <w:p>
+      <w:pPr>
+        <w:rPr>
+          <w:lang w:val="en-GB"/>
+        </w:rPr>
+      </w:pPr>
+      <w:r>
+        <w:rPr>
+          <w:lang w:val="en-GB"/>
+        </w:rPr>
+        <w:t>Code</w:t>
+      </w:r>
+    </w:p>
+    <w:p>
+      <w:pPr>
+        <w:rPr>
+          <w:lang w:val="en-GB"/>
+        </w:rPr>
+      </w:pPr>
+      <w:r>
+        <w:rPr>
+          <w:lang w:val="en-GB"/>
+        </w:rPr>
+        <w:t>data/models/flight_delay_model.pkl</w:t>
       </w:r>
     </w:p>
     <w:p>
@@ -2038,200 +2239,93 @@
           <w:b/>
           <w:bCs/>
         </w:rPr>
-        <w:t>Ce que ça fait :</w:t>
-      </w:r>
-    </w:p>
-    <w:p>
-      <w:pPr>
-        <w:numPr>
-          <w:ilvl w:val="0"/>
-          <w:numId w:val="25"/>
-        </w:numPr>
-      </w:pPr>
-      <w:r>
-        <w:t>Charge les données historiques depuis MongoDB</w:t>
-      </w:r>
-    </w:p>
-    <w:p>
-      <w:pPr>
-        <w:numPr>
-          <w:ilvl w:val="0"/>
-          <w:numId w:val="25"/>
-        </w:numPr>
-      </w:pPr>
-      <w:r>
-        <w:t>Transforme les données via src/ml/features.py</w:t>
-      </w:r>
-    </w:p>
-    <w:p>
-      <w:pPr>
-        <w:numPr>
-          <w:ilvl w:val="0"/>
-          <w:numId w:val="25"/>
-        </w:numPr>
-      </w:pPr>
-      <w:r>
+        <w:t>Fichiers concernés :</w:t>
+      </w:r>
+    </w:p>
+    <w:p>
+      <w:pPr>
+        <w:numPr>
+          <w:ilvl w:val="0"/>
+          <w:numId w:val="26"/>
+        </w:numPr>
+      </w:pPr>
+      <w:r>
+        <w:t>scripts/run_training.py</w:t>
+      </w:r>
+    </w:p>
+    <w:p>
+      <w:pPr>
+        <w:numPr>
+          <w:ilvl w:val="0"/>
+          <w:numId w:val="26"/>
+        </w:numPr>
+      </w:pPr>
+      <w:r>
+        <w:t>src/ml/training.py</w:t>
+      </w:r>
+    </w:p>
+    <w:p>
+      <w:pPr>
+        <w:numPr>
+          <w:ilvl w:val="0"/>
+          <w:numId w:val="26"/>
+        </w:numPr>
+      </w:pPr>
+      <w:r>
+        <w:t>src/ml/features.py</w:t>
+      </w:r>
+    </w:p>
+    <w:p>
+      <w:pPr>
+        <w:numPr>
+          <w:ilvl w:val="0"/>
+          <w:numId w:val="26"/>
+        </w:numPr>
+      </w:pPr>
+      <w:r>
+        <w:t>src/ml/model.py</w:t>
+      </w:r>
+    </w:p>
+    <w:p>
+      <w:pPr>
+        <w:numPr>
+          <w:ilvl w:val="0"/>
+          <w:numId w:val="26"/>
+        </w:numPr>
+        <w:rPr>
+          <w:lang w:val="en-GB"/>
+        </w:rPr>
+      </w:pPr>
+      <w:r>
+        <w:rPr>
+          <w:lang w:val="en-GB"/>
+        </w:rPr>
+        <w:t>data/models/flight_delay_model.pkl</w:t>
+      </w:r>
+    </w:p>
+    <w:p>
+      <w:pPr>
+        <w:rPr>
+          <w:lang w:val="en-GB"/>
+        </w:rPr>
+      </w:pPr>
+    </w:p>
+    <w:p>
+      <w:pPr>
+        <w:rPr>
+          <w:lang w:val="en-GB"/>
+        </w:rPr>
+      </w:pPr>
+      <w:r>
+        <w:rPr>
+          <w:lang w:val="en-GB"/>
+        </w:rPr>
         <w:lastRenderedPageBreak/>
-        <w:t>Construit le pipeline ML via src/ml/model.py</w:t>
-      </w:r>
-    </w:p>
-    <w:p>
-      <w:pPr>
-        <w:numPr>
-          <w:ilvl w:val="0"/>
-          <w:numId w:val="25"/>
-        </w:numPr>
-      </w:pPr>
-      <w:r>
-        <w:t>Entraîne le modèle</w:t>
-      </w:r>
-    </w:p>
-    <w:p>
-      <w:pPr>
-        <w:numPr>
-          <w:ilvl w:val="0"/>
-          <w:numId w:val="25"/>
-        </w:numPr>
-      </w:pPr>
-      <w:r>
-        <w:t>Évalue les performances</w:t>
-      </w:r>
-    </w:p>
-    <w:p>
-      <w:pPr>
-        <w:numPr>
-          <w:ilvl w:val="0"/>
-          <w:numId w:val="25"/>
-        </w:numPr>
-      </w:pPr>
-      <w:r>
-        <w:t>Sauvegarde le modèle final dans :</w:t>
-      </w:r>
-    </w:p>
-    <w:p>
-      <w:pPr>
-        <w:rPr>
-          <w:lang w:val="en-GB"/>
-        </w:rPr>
-      </w:pPr>
-      <w:r>
-        <w:rPr>
-          <w:lang w:val="en-GB"/>
-        </w:rPr>
-        <w:t>Code</w:t>
-      </w:r>
-    </w:p>
-    <w:p>
-      <w:pPr>
-        <w:rPr>
-          <w:lang w:val="en-GB"/>
-        </w:rPr>
-      </w:pPr>
-      <w:r>
-        <w:rPr>
-          <w:lang w:val="en-GB"/>
-        </w:rPr>
-        <w:t>data/models/flight_delay_model.pkl</w:t>
-      </w:r>
-    </w:p>
-    <w:p>
-      <w:pPr>
-        <w:rPr>
-          <w:b/>
-          <w:bCs/>
-        </w:rPr>
-      </w:pPr>
-      <w:r>
-        <w:rPr>
-          <w:b/>
-          <w:bCs/>
-        </w:rPr>
-        <w:t>Fichiers concernés :</w:t>
-      </w:r>
-    </w:p>
-    <w:p>
-      <w:pPr>
-        <w:numPr>
-          <w:ilvl w:val="0"/>
-          <w:numId w:val="26"/>
-        </w:numPr>
-      </w:pPr>
-      <w:r>
-        <w:t>scripts/run_training.py</w:t>
-      </w:r>
-    </w:p>
-    <w:p>
-      <w:pPr>
-        <w:numPr>
-          <w:ilvl w:val="0"/>
-          <w:numId w:val="26"/>
-        </w:numPr>
-      </w:pPr>
-      <w:r>
-        <w:t>src/ml/training.py</w:t>
-      </w:r>
-    </w:p>
-    <w:p>
-      <w:pPr>
-        <w:numPr>
-          <w:ilvl w:val="0"/>
-          <w:numId w:val="26"/>
-        </w:numPr>
-      </w:pPr>
-      <w:r>
-        <w:t>src/ml/features.py</w:t>
-      </w:r>
-    </w:p>
-    <w:p>
-      <w:pPr>
-        <w:numPr>
-          <w:ilvl w:val="0"/>
-          <w:numId w:val="26"/>
-        </w:numPr>
-      </w:pPr>
-      <w:r>
-        <w:t>src/ml/model.py</w:t>
-      </w:r>
-    </w:p>
-    <w:p>
-      <w:pPr>
-        <w:numPr>
-          <w:ilvl w:val="0"/>
-          <w:numId w:val="26"/>
-        </w:numPr>
-        <w:rPr>
-          <w:lang w:val="en-GB"/>
-        </w:rPr>
-      </w:pPr>
-      <w:r>
-        <w:rPr>
-          <w:lang w:val="en-GB"/>
-        </w:rPr>
-        <w:t>data/models/flight_delay_model.pkl</w:t>
-      </w:r>
-    </w:p>
-    <w:p>
-      <w:pPr>
-        <w:rPr>
-          <w:lang w:val="en-GB"/>
-        </w:rPr>
-      </w:pPr>
-    </w:p>
-    <w:p>
-      <w:pPr>
-        <w:rPr>
-          <w:lang w:val="en-GB"/>
-        </w:rPr>
-      </w:pPr>
-      <w:r>
-        <w:rPr>
-          <w:lang w:val="en-GB"/>
-        </w:rPr>
         <w:drawing>
-          <wp:inline distT="0" distB="0" distL="0" distR="0" wp14:anchorId="4B4BEDD5" wp14:editId="21B9A421">
-            <wp:extent cx="5731510" cy="2320925"/>
-            <wp:effectExtent l="0" t="0" r="2540" b="3175"/>
-            <wp:docPr id="983051862" name="Image 1"/>
+          <wp:inline distT="0" distB="0" distL="0" distR="0" wp14:anchorId="54DDED28" wp14:editId="363A9681">
+            <wp:extent cx="5731510" cy="3811270"/>
+            <wp:effectExtent l="0" t="0" r="2540" b="0"/>
+            <wp:docPr id="1184055115" name="Image 1"/>
             <wp:cNvGraphicFramePr>
               <a:graphicFrameLocks xmlns:a="http://schemas.openxmlformats.org/drawingml/2006/main" noChangeAspect="1"/>
             </wp:cNvGraphicFramePr>
@@ -2239,7 +2333,7 @@
               <a:graphicData uri="http://schemas.openxmlformats.org/drawingml/2006/picture">
                 <pic:pic xmlns:pic="http://schemas.openxmlformats.org/drawingml/2006/picture">
                   <pic:nvPicPr>
-                    <pic:cNvPr id="983051862" name=""/>
+                    <pic:cNvPr id="1184055115" name=""/>
                     <pic:cNvPicPr/>
                   </pic:nvPicPr>
                   <pic:blipFill>
@@ -2251,7 +2345,7 @@
                   <pic:spPr>
                     <a:xfrm>
                       <a:off x="0" y="0"/>
-                      <a:ext cx="5731510" cy="2320925"/>
+                      <a:ext cx="5731510" cy="3811270"/>
                     </a:xfrm>
                     <a:prstGeom prst="rect">
                       <a:avLst/>
@@ -2263,62 +2357,6 @@
           </wp:inline>
         </w:drawing>
       </w:r>
-    </w:p>
-    <w:p>
-      <w:pPr>
-        <w:rPr>
-          <w:lang w:val="en-GB"/>
-        </w:rPr>
-      </w:pPr>
-    </w:p>
-    <w:p>
-      <w:pPr>
-        <w:rPr>
-          <w:lang w:val="en-GB"/>
-        </w:rPr>
-      </w:pPr>
-    </w:p>
-    <w:p>
-      <w:pPr>
-        <w:rPr>
-          <w:lang w:val="en-GB"/>
-        </w:rPr>
-      </w:pPr>
-    </w:p>
-    <w:p>
-      <w:pPr>
-        <w:rPr>
-          <w:lang w:val="en-GB"/>
-        </w:rPr>
-      </w:pPr>
-    </w:p>
-    <w:p>
-      <w:pPr>
-        <w:rPr>
-          <w:lang w:val="en-GB"/>
-        </w:rPr>
-      </w:pPr>
-    </w:p>
-    <w:p>
-      <w:pPr>
-        <w:rPr>
-          <w:lang w:val="en-GB"/>
-        </w:rPr>
-      </w:pPr>
-    </w:p>
-    <w:p>
-      <w:pPr>
-        <w:rPr>
-          <w:lang w:val="en-GB"/>
-        </w:rPr>
-      </w:pPr>
-    </w:p>
-    <w:p>
-      <w:pPr>
-        <w:rPr>
-          <w:lang w:val="en-GB"/>
-        </w:rPr>
-      </w:pPr>
     </w:p>
     <w:p>
       <w:pPr>
@@ -2496,6 +2534,155 @@
     </w:lvl>
   </w:abstractNum>
   <w:abstractNum w:abstractNumId="1" w15:restartNumberingAfterBreak="0">
+    <w:nsid w:val="049033BB"/>
+    <w:multiLevelType w:val="multilevel"/>
+    <w:tmpl w:val="819E1304"/>
+    <w:lvl w:ilvl="0">
+      <w:start w:val="1"/>
+      <w:numFmt w:val="bullet"/>
+      <w:lvlText w:val=""/>
+      <w:lvlJc w:val="left"/>
+      <w:pPr>
+        <w:tabs>
+          <w:tab w:val="num" w:pos="720"/>
+        </w:tabs>
+        <w:ind w:left="720" w:hanging="360"/>
+      </w:pPr>
+      <w:rPr>
+        <w:rFonts w:ascii="Symbol" w:hAnsi="Symbol" w:hint="default"/>
+        <w:sz w:val="20"/>
+      </w:rPr>
+    </w:lvl>
+    <w:lvl w:ilvl="1" w:tentative="1">
+      <w:start w:val="1"/>
+      <w:numFmt w:val="bullet"/>
+      <w:lvlText w:val="o"/>
+      <w:lvlJc w:val="left"/>
+      <w:pPr>
+        <w:tabs>
+          <w:tab w:val="num" w:pos="1440"/>
+        </w:tabs>
+        <w:ind w:left="1440" w:hanging="360"/>
+      </w:pPr>
+      <w:rPr>
+        <w:rFonts w:ascii="Courier New" w:hAnsi="Courier New" w:hint="default"/>
+        <w:sz w:val="20"/>
+      </w:rPr>
+    </w:lvl>
+    <w:lvl w:ilvl="2" w:tentative="1">
+      <w:start w:val="1"/>
+      <w:numFmt w:val="bullet"/>
+      <w:lvlText w:val=""/>
+      <w:lvlJc w:val="left"/>
+      <w:pPr>
+        <w:tabs>
+          <w:tab w:val="num" w:pos="2160"/>
+        </w:tabs>
+        <w:ind w:left="2160" w:hanging="360"/>
+      </w:pPr>
+      <w:rPr>
+        <w:rFonts w:ascii="Wingdings" w:hAnsi="Wingdings" w:hint="default"/>
+        <w:sz w:val="20"/>
+      </w:rPr>
+    </w:lvl>
+    <w:lvl w:ilvl="3" w:tentative="1">
+      <w:start w:val="1"/>
+      <w:numFmt w:val="bullet"/>
+      <w:lvlText w:val=""/>
+      <w:lvlJc w:val="left"/>
+      <w:pPr>
+        <w:tabs>
+          <w:tab w:val="num" w:pos="2880"/>
+        </w:tabs>
+        <w:ind w:left="2880" w:hanging="360"/>
+      </w:pPr>
+      <w:rPr>
+        <w:rFonts w:ascii="Wingdings" w:hAnsi="Wingdings" w:hint="default"/>
+        <w:sz w:val="20"/>
+      </w:rPr>
+    </w:lvl>
+    <w:lvl w:ilvl="4" w:tentative="1">
+      <w:start w:val="1"/>
+      <w:numFmt w:val="bullet"/>
+      <w:lvlText w:val=""/>
+      <w:lvlJc w:val="left"/>
+      <w:pPr>
+        <w:tabs>
+          <w:tab w:val="num" w:pos="3600"/>
+        </w:tabs>
+        <w:ind w:left="3600" w:hanging="360"/>
+      </w:pPr>
+      <w:rPr>
+        <w:rFonts w:ascii="Wingdings" w:hAnsi="Wingdings" w:hint="default"/>
+        <w:sz w:val="20"/>
+      </w:rPr>
+    </w:lvl>
+    <w:lvl w:ilvl="5" w:tentative="1">
+      <w:start w:val="1"/>
+      <w:numFmt w:val="bullet"/>
+      <w:lvlText w:val=""/>
+      <w:lvlJc w:val="left"/>
+      <w:pPr>
+        <w:tabs>
+          <w:tab w:val="num" w:pos="4320"/>
+        </w:tabs>
+        <w:ind w:left="4320" w:hanging="360"/>
+      </w:pPr>
+      <w:rPr>
+        <w:rFonts w:ascii="Wingdings" w:hAnsi="Wingdings" w:hint="default"/>
+        <w:sz w:val="20"/>
+      </w:rPr>
+    </w:lvl>
+    <w:lvl w:ilvl="6" w:tentative="1">
+      <w:start w:val="1"/>
+      <w:numFmt w:val="bullet"/>
+      <w:lvlText w:val=""/>
+      <w:lvlJc w:val="left"/>
+      <w:pPr>
+        <w:tabs>
+          <w:tab w:val="num" w:pos="5040"/>
+        </w:tabs>
+        <w:ind w:left="5040" w:hanging="360"/>
+      </w:pPr>
+      <w:rPr>
+        <w:rFonts w:ascii="Wingdings" w:hAnsi="Wingdings" w:hint="default"/>
+        <w:sz w:val="20"/>
+      </w:rPr>
+    </w:lvl>
+    <w:lvl w:ilvl="7" w:tentative="1">
+      <w:start w:val="1"/>
+      <w:numFmt w:val="bullet"/>
+      <w:lvlText w:val=""/>
+      <w:lvlJc w:val="left"/>
+      <w:pPr>
+        <w:tabs>
+          <w:tab w:val="num" w:pos="5760"/>
+        </w:tabs>
+        <w:ind w:left="5760" w:hanging="360"/>
+      </w:pPr>
+      <w:rPr>
+        <w:rFonts w:ascii="Wingdings" w:hAnsi="Wingdings" w:hint="default"/>
+        <w:sz w:val="20"/>
+      </w:rPr>
+    </w:lvl>
+    <w:lvl w:ilvl="8" w:tentative="1">
+      <w:start w:val="1"/>
+      <w:numFmt w:val="bullet"/>
+      <w:lvlText w:val=""/>
+      <w:lvlJc w:val="left"/>
+      <w:pPr>
+        <w:tabs>
+          <w:tab w:val="num" w:pos="6480"/>
+        </w:tabs>
+        <w:ind w:left="6480" w:hanging="360"/>
+      </w:pPr>
+      <w:rPr>
+        <w:rFonts w:ascii="Wingdings" w:hAnsi="Wingdings" w:hint="default"/>
+        <w:sz w:val="20"/>
+      </w:rPr>
+    </w:lvl>
+  </w:abstractNum>
+  <w:abstractNum w:abstractNumId="2" w15:restartNumberingAfterBreak="0">
     <w:nsid w:val="074FA43E"/>
     <w:multiLevelType w:val="hybridMultilevel"/>
     <w:tmpl w:val="5DC00582"/>
@@ -2608,7 +2795,7 @@
       </w:rPr>
     </w:lvl>
   </w:abstractNum>
-  <w:abstractNum w:abstractNumId="2" w15:restartNumberingAfterBreak="0">
+  <w:abstractNum w:abstractNumId="3" w15:restartNumberingAfterBreak="0">
     <w:nsid w:val="0D216D31"/>
     <w:multiLevelType w:val="hybridMultilevel"/>
     <w:tmpl w:val="54E2C5E2"/>
@@ -2721,7 +2908,7 @@
       </w:rPr>
     </w:lvl>
   </w:abstractNum>
-  <w:abstractNum w:abstractNumId="3" w15:restartNumberingAfterBreak="0">
+  <w:abstractNum w:abstractNumId="4" w15:restartNumberingAfterBreak="0">
     <w:nsid w:val="15853564"/>
     <w:multiLevelType w:val="multilevel"/>
     <w:tmpl w:val="EB2696BA"/>
@@ -2870,7 +3057,7 @@
       </w:rPr>
     </w:lvl>
   </w:abstractNum>
-  <w:abstractNum w:abstractNumId="4" w15:restartNumberingAfterBreak="0">
+  <w:abstractNum w:abstractNumId="5" w15:restartNumberingAfterBreak="0">
     <w:nsid w:val="17F667AC"/>
     <w:multiLevelType w:val="multilevel"/>
     <w:tmpl w:val="F13E9176"/>
@@ -3019,7 +3206,7 @@
       </w:rPr>
     </w:lvl>
   </w:abstractNum>
-  <w:abstractNum w:abstractNumId="5" w15:restartNumberingAfterBreak="0">
+  <w:abstractNum w:abstractNumId="6" w15:restartNumberingAfterBreak="0">
     <w:nsid w:val="24172FB0"/>
     <w:multiLevelType w:val="multilevel"/>
     <w:tmpl w:val="73CCB75C"/>
@@ -3168,7 +3355,7 @@
       </w:rPr>
     </w:lvl>
   </w:abstractNum>
-  <w:abstractNum w:abstractNumId="6" w15:restartNumberingAfterBreak="0">
+  <w:abstractNum w:abstractNumId="7" w15:restartNumberingAfterBreak="0">
     <w:nsid w:val="2821C1B8"/>
     <w:multiLevelType w:val="hybridMultilevel"/>
     <w:tmpl w:val="ED20772E"/>
@@ -3281,7 +3468,7 @@
       </w:rPr>
     </w:lvl>
   </w:abstractNum>
-  <w:abstractNum w:abstractNumId="7" w15:restartNumberingAfterBreak="0">
+  <w:abstractNum w:abstractNumId="8" w15:restartNumberingAfterBreak="0">
     <w:nsid w:val="29BE11F7"/>
     <w:multiLevelType w:val="multilevel"/>
     <w:tmpl w:val="E09687BA"/>
@@ -3430,7 +3617,7 @@
       </w:rPr>
     </w:lvl>
   </w:abstractNum>
-  <w:abstractNum w:abstractNumId="8" w15:restartNumberingAfterBreak="0">
+  <w:abstractNum w:abstractNumId="9" w15:restartNumberingAfterBreak="0">
     <w:nsid w:val="30AA2F55"/>
     <w:multiLevelType w:val="multilevel"/>
     <w:tmpl w:val="2D72BE06"/>
@@ -3579,7 +3766,156 @@
       </w:rPr>
     </w:lvl>
   </w:abstractNum>
-  <w:abstractNum w:abstractNumId="9" w15:restartNumberingAfterBreak="0">
+  <w:abstractNum w:abstractNumId="10" w15:restartNumberingAfterBreak="0">
+    <w:nsid w:val="33C674E7"/>
+    <w:multiLevelType w:val="multilevel"/>
+    <w:tmpl w:val="2C145606"/>
+    <w:lvl w:ilvl="0">
+      <w:start w:val="1"/>
+      <w:numFmt w:val="bullet"/>
+      <w:lvlText w:val=""/>
+      <w:lvlJc w:val="left"/>
+      <w:pPr>
+        <w:tabs>
+          <w:tab w:val="num" w:pos="720"/>
+        </w:tabs>
+        <w:ind w:left="720" w:hanging="360"/>
+      </w:pPr>
+      <w:rPr>
+        <w:rFonts w:ascii="Symbol" w:hAnsi="Symbol" w:hint="default"/>
+        <w:sz w:val="20"/>
+      </w:rPr>
+    </w:lvl>
+    <w:lvl w:ilvl="1" w:tentative="1">
+      <w:start w:val="1"/>
+      <w:numFmt w:val="bullet"/>
+      <w:lvlText w:val="o"/>
+      <w:lvlJc w:val="left"/>
+      <w:pPr>
+        <w:tabs>
+          <w:tab w:val="num" w:pos="1440"/>
+        </w:tabs>
+        <w:ind w:left="1440" w:hanging="360"/>
+      </w:pPr>
+      <w:rPr>
+        <w:rFonts w:ascii="Courier New" w:hAnsi="Courier New" w:hint="default"/>
+        <w:sz w:val="20"/>
+      </w:rPr>
+    </w:lvl>
+    <w:lvl w:ilvl="2" w:tentative="1">
+      <w:start w:val="1"/>
+      <w:numFmt w:val="bullet"/>
+      <w:lvlText w:val=""/>
+      <w:lvlJc w:val="left"/>
+      <w:pPr>
+        <w:tabs>
+          <w:tab w:val="num" w:pos="2160"/>
+        </w:tabs>
+        <w:ind w:left="2160" w:hanging="360"/>
+      </w:pPr>
+      <w:rPr>
+        <w:rFonts w:ascii="Wingdings" w:hAnsi="Wingdings" w:hint="default"/>
+        <w:sz w:val="20"/>
+      </w:rPr>
+    </w:lvl>
+    <w:lvl w:ilvl="3" w:tentative="1">
+      <w:start w:val="1"/>
+      <w:numFmt w:val="bullet"/>
+      <w:lvlText w:val=""/>
+      <w:lvlJc w:val="left"/>
+      <w:pPr>
+        <w:tabs>
+          <w:tab w:val="num" w:pos="2880"/>
+        </w:tabs>
+        <w:ind w:left="2880" w:hanging="360"/>
+      </w:pPr>
+      <w:rPr>
+        <w:rFonts w:ascii="Wingdings" w:hAnsi="Wingdings" w:hint="default"/>
+        <w:sz w:val="20"/>
+      </w:rPr>
+    </w:lvl>
+    <w:lvl w:ilvl="4" w:tentative="1">
+      <w:start w:val="1"/>
+      <w:numFmt w:val="bullet"/>
+      <w:lvlText w:val=""/>
+      <w:lvlJc w:val="left"/>
+      <w:pPr>
+        <w:tabs>
+          <w:tab w:val="num" w:pos="3600"/>
+        </w:tabs>
+        <w:ind w:left="3600" w:hanging="360"/>
+      </w:pPr>
+      <w:rPr>
+        <w:rFonts w:ascii="Wingdings" w:hAnsi="Wingdings" w:hint="default"/>
+        <w:sz w:val="20"/>
+      </w:rPr>
+    </w:lvl>
+    <w:lvl w:ilvl="5" w:tentative="1">
+      <w:start w:val="1"/>
+      <w:numFmt w:val="bullet"/>
+      <w:lvlText w:val=""/>
+      <w:lvlJc w:val="left"/>
+      <w:pPr>
+        <w:tabs>
+          <w:tab w:val="num" w:pos="4320"/>
+        </w:tabs>
+        <w:ind w:left="4320" w:hanging="360"/>
+      </w:pPr>
+      <w:rPr>
+        <w:rFonts w:ascii="Wingdings" w:hAnsi="Wingdings" w:hint="default"/>
+        <w:sz w:val="20"/>
+      </w:rPr>
+    </w:lvl>
+    <w:lvl w:ilvl="6" w:tentative="1">
+      <w:start w:val="1"/>
+      <w:numFmt w:val="bullet"/>
+      <w:lvlText w:val=""/>
+      <w:lvlJc w:val="left"/>
+      <w:pPr>
+        <w:tabs>
+          <w:tab w:val="num" w:pos="5040"/>
+        </w:tabs>
+        <w:ind w:left="5040" w:hanging="360"/>
+      </w:pPr>
+      <w:rPr>
+        <w:rFonts w:ascii="Wingdings" w:hAnsi="Wingdings" w:hint="default"/>
+        <w:sz w:val="20"/>
+      </w:rPr>
+    </w:lvl>
+    <w:lvl w:ilvl="7" w:tentative="1">
+      <w:start w:val="1"/>
+      <w:numFmt w:val="bullet"/>
+      <w:lvlText w:val=""/>
+      <w:lvlJc w:val="left"/>
+      <w:pPr>
+        <w:tabs>
+          <w:tab w:val="num" w:pos="5760"/>
+        </w:tabs>
+        <w:ind w:left="5760" w:hanging="360"/>
+      </w:pPr>
+      <w:rPr>
+        <w:rFonts w:ascii="Wingdings" w:hAnsi="Wingdings" w:hint="default"/>
+        <w:sz w:val="20"/>
+      </w:rPr>
+    </w:lvl>
+    <w:lvl w:ilvl="8" w:tentative="1">
+      <w:start w:val="1"/>
+      <w:numFmt w:val="bullet"/>
+      <w:lvlText w:val=""/>
+      <w:lvlJc w:val="left"/>
+      <w:pPr>
+        <w:tabs>
+          <w:tab w:val="num" w:pos="6480"/>
+        </w:tabs>
+        <w:ind w:left="6480" w:hanging="360"/>
+      </w:pPr>
+      <w:rPr>
+        <w:rFonts w:ascii="Wingdings" w:hAnsi="Wingdings" w:hint="default"/>
+        <w:sz w:val="20"/>
+      </w:rPr>
+    </w:lvl>
+  </w:abstractNum>
+  <w:abstractNum w:abstractNumId="11" w15:restartNumberingAfterBreak="0">
     <w:nsid w:val="34904974"/>
     <w:multiLevelType w:val="multilevel"/>
     <w:tmpl w:val="54F23336"/>
@@ -3728,7 +4064,156 @@
       </w:rPr>
     </w:lvl>
   </w:abstractNum>
-  <w:abstractNum w:abstractNumId="10" w15:restartNumberingAfterBreak="0">
+  <w:abstractNum w:abstractNumId="12" w15:restartNumberingAfterBreak="0">
+    <w:nsid w:val="37062145"/>
+    <w:multiLevelType w:val="multilevel"/>
+    <w:tmpl w:val="078E328E"/>
+    <w:lvl w:ilvl="0">
+      <w:start w:val="1"/>
+      <w:numFmt w:val="bullet"/>
+      <w:lvlText w:val=""/>
+      <w:lvlJc w:val="left"/>
+      <w:pPr>
+        <w:tabs>
+          <w:tab w:val="num" w:pos="720"/>
+        </w:tabs>
+        <w:ind w:left="720" w:hanging="360"/>
+      </w:pPr>
+      <w:rPr>
+        <w:rFonts w:ascii="Symbol" w:hAnsi="Symbol" w:hint="default"/>
+        <w:sz w:val="20"/>
+      </w:rPr>
+    </w:lvl>
+    <w:lvl w:ilvl="1" w:tentative="1">
+      <w:start w:val="1"/>
+      <w:numFmt w:val="bullet"/>
+      <w:lvlText w:val="o"/>
+      <w:lvlJc w:val="left"/>
+      <w:pPr>
+        <w:tabs>
+          <w:tab w:val="num" w:pos="1440"/>
+        </w:tabs>
+        <w:ind w:left="1440" w:hanging="360"/>
+      </w:pPr>
+      <w:rPr>
+        <w:rFonts w:ascii="Courier New" w:hAnsi="Courier New" w:hint="default"/>
+        <w:sz w:val="20"/>
+      </w:rPr>
+    </w:lvl>
+    <w:lvl w:ilvl="2" w:tentative="1">
+      <w:start w:val="1"/>
+      <w:numFmt w:val="bullet"/>
+      <w:lvlText w:val=""/>
+      <w:lvlJc w:val="left"/>
+      <w:pPr>
+        <w:tabs>
+          <w:tab w:val="num" w:pos="2160"/>
+        </w:tabs>
+        <w:ind w:left="2160" w:hanging="360"/>
+      </w:pPr>
+      <w:rPr>
+        <w:rFonts w:ascii="Wingdings" w:hAnsi="Wingdings" w:hint="default"/>
+        <w:sz w:val="20"/>
+      </w:rPr>
+    </w:lvl>
+    <w:lvl w:ilvl="3" w:tentative="1">
+      <w:start w:val="1"/>
+      <w:numFmt w:val="bullet"/>
+      <w:lvlText w:val=""/>
+      <w:lvlJc w:val="left"/>
+      <w:pPr>
+        <w:tabs>
+          <w:tab w:val="num" w:pos="2880"/>
+        </w:tabs>
+        <w:ind w:left="2880" w:hanging="360"/>
+      </w:pPr>
+      <w:rPr>
+        <w:rFonts w:ascii="Wingdings" w:hAnsi="Wingdings" w:hint="default"/>
+        <w:sz w:val="20"/>
+      </w:rPr>
+    </w:lvl>
+    <w:lvl w:ilvl="4" w:tentative="1">
+      <w:start w:val="1"/>
+      <w:numFmt w:val="bullet"/>
+      <w:lvlText w:val=""/>
+      <w:lvlJc w:val="left"/>
+      <w:pPr>
+        <w:tabs>
+          <w:tab w:val="num" w:pos="3600"/>
+        </w:tabs>
+        <w:ind w:left="3600" w:hanging="360"/>
+      </w:pPr>
+      <w:rPr>
+        <w:rFonts w:ascii="Wingdings" w:hAnsi="Wingdings" w:hint="default"/>
+        <w:sz w:val="20"/>
+      </w:rPr>
+    </w:lvl>
+    <w:lvl w:ilvl="5" w:tentative="1">
+      <w:start w:val="1"/>
+      <w:numFmt w:val="bullet"/>
+      <w:lvlText w:val=""/>
+      <w:lvlJc w:val="left"/>
+      <w:pPr>
+        <w:tabs>
+          <w:tab w:val="num" w:pos="4320"/>
+        </w:tabs>
+        <w:ind w:left="4320" w:hanging="360"/>
+      </w:pPr>
+      <w:rPr>
+        <w:rFonts w:ascii="Wingdings" w:hAnsi="Wingdings" w:hint="default"/>
+        <w:sz w:val="20"/>
+      </w:rPr>
+    </w:lvl>
+    <w:lvl w:ilvl="6" w:tentative="1">
+      <w:start w:val="1"/>
+      <w:numFmt w:val="bullet"/>
+      <w:lvlText w:val=""/>
+      <w:lvlJc w:val="left"/>
+      <w:pPr>
+        <w:tabs>
+          <w:tab w:val="num" w:pos="5040"/>
+        </w:tabs>
+        <w:ind w:left="5040" w:hanging="360"/>
+      </w:pPr>
+      <w:rPr>
+        <w:rFonts w:ascii="Wingdings" w:hAnsi="Wingdings" w:hint="default"/>
+        <w:sz w:val="20"/>
+      </w:rPr>
+    </w:lvl>
+    <w:lvl w:ilvl="7" w:tentative="1">
+      <w:start w:val="1"/>
+      <w:numFmt w:val="bullet"/>
+      <w:lvlText w:val=""/>
+      <w:lvlJc w:val="left"/>
+      <w:pPr>
+        <w:tabs>
+          <w:tab w:val="num" w:pos="5760"/>
+        </w:tabs>
+        <w:ind w:left="5760" w:hanging="360"/>
+      </w:pPr>
+      <w:rPr>
+        <w:rFonts w:ascii="Wingdings" w:hAnsi="Wingdings" w:hint="default"/>
+        <w:sz w:val="20"/>
+      </w:rPr>
+    </w:lvl>
+    <w:lvl w:ilvl="8" w:tentative="1">
+      <w:start w:val="1"/>
+      <w:numFmt w:val="bullet"/>
+      <w:lvlText w:val=""/>
+      <w:lvlJc w:val="left"/>
+      <w:pPr>
+        <w:tabs>
+          <w:tab w:val="num" w:pos="6480"/>
+        </w:tabs>
+        <w:ind w:left="6480" w:hanging="360"/>
+      </w:pPr>
+      <w:rPr>
+        <w:rFonts w:ascii="Wingdings" w:hAnsi="Wingdings" w:hint="default"/>
+        <w:sz w:val="20"/>
+      </w:rPr>
+    </w:lvl>
+  </w:abstractNum>
+  <w:abstractNum w:abstractNumId="13" w15:restartNumberingAfterBreak="0">
     <w:nsid w:val="3E893F64"/>
     <w:multiLevelType w:val="multilevel"/>
     <w:tmpl w:val="64125DD8"/>
@@ -3877,7 +4362,156 @@
       </w:rPr>
     </w:lvl>
   </w:abstractNum>
-  <w:abstractNum w:abstractNumId="11" w15:restartNumberingAfterBreak="0">
+  <w:abstractNum w:abstractNumId="14" w15:restartNumberingAfterBreak="0">
+    <w:nsid w:val="41DB304A"/>
+    <w:multiLevelType w:val="multilevel"/>
+    <w:tmpl w:val="97FC1AD6"/>
+    <w:lvl w:ilvl="0">
+      <w:start w:val="1"/>
+      <w:numFmt w:val="bullet"/>
+      <w:lvlText w:val=""/>
+      <w:lvlJc w:val="left"/>
+      <w:pPr>
+        <w:tabs>
+          <w:tab w:val="num" w:pos="720"/>
+        </w:tabs>
+        <w:ind w:left="720" w:hanging="360"/>
+      </w:pPr>
+      <w:rPr>
+        <w:rFonts w:ascii="Symbol" w:hAnsi="Symbol" w:hint="default"/>
+        <w:sz w:val="20"/>
+      </w:rPr>
+    </w:lvl>
+    <w:lvl w:ilvl="1" w:tentative="1">
+      <w:start w:val="1"/>
+      <w:numFmt w:val="bullet"/>
+      <w:lvlText w:val="o"/>
+      <w:lvlJc w:val="left"/>
+      <w:pPr>
+        <w:tabs>
+          <w:tab w:val="num" w:pos="1440"/>
+        </w:tabs>
+        <w:ind w:left="1440" w:hanging="360"/>
+      </w:pPr>
+      <w:rPr>
+        <w:rFonts w:ascii="Courier New" w:hAnsi="Courier New" w:hint="default"/>
+        <w:sz w:val="20"/>
+      </w:rPr>
+    </w:lvl>
+    <w:lvl w:ilvl="2" w:tentative="1">
+      <w:start w:val="1"/>
+      <w:numFmt w:val="bullet"/>
+      <w:lvlText w:val=""/>
+      <w:lvlJc w:val="left"/>
+      <w:pPr>
+        <w:tabs>
+          <w:tab w:val="num" w:pos="2160"/>
+        </w:tabs>
+        <w:ind w:left="2160" w:hanging="360"/>
+      </w:pPr>
+      <w:rPr>
+        <w:rFonts w:ascii="Wingdings" w:hAnsi="Wingdings" w:hint="default"/>
+        <w:sz w:val="20"/>
+      </w:rPr>
+    </w:lvl>
+    <w:lvl w:ilvl="3" w:tentative="1">
+      <w:start w:val="1"/>
+      <w:numFmt w:val="bullet"/>
+      <w:lvlText w:val=""/>
+      <w:lvlJc w:val="left"/>
+      <w:pPr>
+        <w:tabs>
+          <w:tab w:val="num" w:pos="2880"/>
+        </w:tabs>
+        <w:ind w:left="2880" w:hanging="360"/>
+      </w:pPr>
+      <w:rPr>
+        <w:rFonts w:ascii="Wingdings" w:hAnsi="Wingdings" w:hint="default"/>
+        <w:sz w:val="20"/>
+      </w:rPr>
+    </w:lvl>
+    <w:lvl w:ilvl="4" w:tentative="1">
+      <w:start w:val="1"/>
+      <w:numFmt w:val="bullet"/>
+      <w:lvlText w:val=""/>
+      <w:lvlJc w:val="left"/>
+      <w:pPr>
+        <w:tabs>
+          <w:tab w:val="num" w:pos="3600"/>
+        </w:tabs>
+        <w:ind w:left="3600" w:hanging="360"/>
+      </w:pPr>
+      <w:rPr>
+        <w:rFonts w:ascii="Wingdings" w:hAnsi="Wingdings" w:hint="default"/>
+        <w:sz w:val="20"/>
+      </w:rPr>
+    </w:lvl>
+    <w:lvl w:ilvl="5" w:tentative="1">
+      <w:start w:val="1"/>
+      <w:numFmt w:val="bullet"/>
+      <w:lvlText w:val=""/>
+      <w:lvlJc w:val="left"/>
+      <w:pPr>
+        <w:tabs>
+          <w:tab w:val="num" w:pos="4320"/>
+        </w:tabs>
+        <w:ind w:left="4320" w:hanging="360"/>
+      </w:pPr>
+      <w:rPr>
+        <w:rFonts w:ascii="Wingdings" w:hAnsi="Wingdings" w:hint="default"/>
+        <w:sz w:val="20"/>
+      </w:rPr>
+    </w:lvl>
+    <w:lvl w:ilvl="6" w:tentative="1">
+      <w:start w:val="1"/>
+      <w:numFmt w:val="bullet"/>
+      <w:lvlText w:val=""/>
+      <w:lvlJc w:val="left"/>
+      <w:pPr>
+        <w:tabs>
+          <w:tab w:val="num" w:pos="5040"/>
+        </w:tabs>
+        <w:ind w:left="5040" w:hanging="360"/>
+      </w:pPr>
+      <w:rPr>
+        <w:rFonts w:ascii="Wingdings" w:hAnsi="Wingdings" w:hint="default"/>
+        <w:sz w:val="20"/>
+      </w:rPr>
+    </w:lvl>
+    <w:lvl w:ilvl="7" w:tentative="1">
+      <w:start w:val="1"/>
+      <w:numFmt w:val="bullet"/>
+      <w:lvlText w:val=""/>
+      <w:lvlJc w:val="left"/>
+      <w:pPr>
+        <w:tabs>
+          <w:tab w:val="num" w:pos="5760"/>
+        </w:tabs>
+        <w:ind w:left="5760" w:hanging="360"/>
+      </w:pPr>
+      <w:rPr>
+        <w:rFonts w:ascii="Wingdings" w:hAnsi="Wingdings" w:hint="default"/>
+        <w:sz w:val="20"/>
+      </w:rPr>
+    </w:lvl>
+    <w:lvl w:ilvl="8" w:tentative="1">
+      <w:start w:val="1"/>
+      <w:numFmt w:val="bullet"/>
+      <w:lvlText w:val=""/>
+      <w:lvlJc w:val="left"/>
+      <w:pPr>
+        <w:tabs>
+          <w:tab w:val="num" w:pos="6480"/>
+        </w:tabs>
+        <w:ind w:left="6480" w:hanging="360"/>
+      </w:pPr>
+      <w:rPr>
+        <w:rFonts w:ascii="Wingdings" w:hAnsi="Wingdings" w:hint="default"/>
+        <w:sz w:val="20"/>
+      </w:rPr>
+    </w:lvl>
+  </w:abstractNum>
+  <w:abstractNum w:abstractNumId="15" w15:restartNumberingAfterBreak="0">
     <w:nsid w:val="44721D9A"/>
     <w:multiLevelType w:val="multilevel"/>
     <w:tmpl w:val="B59CA76C"/>
@@ -3990,7 +4624,7 @@
       </w:pPr>
     </w:lvl>
   </w:abstractNum>
-  <w:abstractNum w:abstractNumId="12" w15:restartNumberingAfterBreak="0">
+  <w:abstractNum w:abstractNumId="16" w15:restartNumberingAfterBreak="0">
     <w:nsid w:val="4D39457F"/>
     <w:multiLevelType w:val="multilevel"/>
     <w:tmpl w:val="A99A1E48"/>
@@ -4139,7 +4773,7 @@
       </w:rPr>
     </w:lvl>
   </w:abstractNum>
-  <w:abstractNum w:abstractNumId="13" w15:restartNumberingAfterBreak="0">
+  <w:abstractNum w:abstractNumId="17" w15:restartNumberingAfterBreak="0">
     <w:nsid w:val="504EB451"/>
     <w:multiLevelType w:val="hybridMultilevel"/>
     <w:tmpl w:val="4B36DF92"/>
@@ -4252,7 +4886,7 @@
       </w:rPr>
     </w:lvl>
   </w:abstractNum>
-  <w:abstractNum w:abstractNumId="14" w15:restartNumberingAfterBreak="0">
+  <w:abstractNum w:abstractNumId="18" w15:restartNumberingAfterBreak="0">
     <w:nsid w:val="59FB4557"/>
     <w:multiLevelType w:val="multilevel"/>
     <w:tmpl w:val="C97078C0"/>
@@ -4401,7 +5035,7 @@
       </w:rPr>
     </w:lvl>
   </w:abstractNum>
-  <w:abstractNum w:abstractNumId="15" w15:restartNumberingAfterBreak="0">
+  <w:abstractNum w:abstractNumId="19" w15:restartNumberingAfterBreak="0">
     <w:nsid w:val="5AB81A1B"/>
     <w:multiLevelType w:val="hybridMultilevel"/>
     <w:tmpl w:val="4F9472F4"/>
@@ -4490,7 +5124,7 @@
       </w:pPr>
     </w:lvl>
   </w:abstractNum>
-  <w:abstractNum w:abstractNumId="16" w15:restartNumberingAfterBreak="0">
+  <w:abstractNum w:abstractNumId="20" w15:restartNumberingAfterBreak="0">
     <w:nsid w:val="62058A1D"/>
     <w:multiLevelType w:val="hybridMultilevel"/>
     <w:tmpl w:val="B8DC7DCA"/>
@@ -4603,7 +5237,7 @@
       </w:rPr>
     </w:lvl>
   </w:abstractNum>
-  <w:abstractNum w:abstractNumId="17" w15:restartNumberingAfterBreak="0">
+  <w:abstractNum w:abstractNumId="21" w15:restartNumberingAfterBreak="0">
     <w:nsid w:val="671E2434"/>
     <w:multiLevelType w:val="multilevel"/>
     <w:tmpl w:val="30221074"/>
@@ -4752,7 +5386,7 @@
       </w:rPr>
     </w:lvl>
   </w:abstractNum>
-  <w:abstractNum w:abstractNumId="18" w15:restartNumberingAfterBreak="0">
+  <w:abstractNum w:abstractNumId="22" w15:restartNumberingAfterBreak="0">
     <w:nsid w:val="6AC8552A"/>
     <w:multiLevelType w:val="multilevel"/>
     <w:tmpl w:val="0D90B094"/>
@@ -4865,7 +5499,7 @@
       </w:pPr>
     </w:lvl>
   </w:abstractNum>
-  <w:abstractNum w:abstractNumId="19" w15:restartNumberingAfterBreak="0">
+  <w:abstractNum w:abstractNumId="23" w15:restartNumberingAfterBreak="0">
     <w:nsid w:val="6B863555"/>
     <w:multiLevelType w:val="multilevel"/>
     <w:tmpl w:val="868AD64E"/>
@@ -4978,7 +5612,7 @@
       </w:pPr>
     </w:lvl>
   </w:abstractNum>
-  <w:abstractNum w:abstractNumId="20" w15:restartNumberingAfterBreak="0">
+  <w:abstractNum w:abstractNumId="24" w15:restartNumberingAfterBreak="0">
     <w:nsid w:val="6D3F65BE"/>
     <w:multiLevelType w:val="hybridMultilevel"/>
     <w:tmpl w:val="FD16F304"/>
@@ -5091,7 +5725,7 @@
       </w:rPr>
     </w:lvl>
   </w:abstractNum>
-  <w:abstractNum w:abstractNumId="21" w15:restartNumberingAfterBreak="0">
+  <w:abstractNum w:abstractNumId="25" w15:restartNumberingAfterBreak="0">
     <w:nsid w:val="71301413"/>
     <w:multiLevelType w:val="multilevel"/>
     <w:tmpl w:val="B5D8A70C"/>
@@ -5240,7 +5874,7 @@
       </w:rPr>
     </w:lvl>
   </w:abstractNum>
-  <w:abstractNum w:abstractNumId="22" w15:restartNumberingAfterBreak="0">
+  <w:abstractNum w:abstractNumId="26" w15:restartNumberingAfterBreak="0">
     <w:nsid w:val="7313756D"/>
     <w:multiLevelType w:val="multilevel"/>
     <w:tmpl w:val="71B00B6E"/>
@@ -5389,7 +6023,7 @@
       </w:rPr>
     </w:lvl>
   </w:abstractNum>
-  <w:abstractNum w:abstractNumId="23" w15:restartNumberingAfterBreak="0">
+  <w:abstractNum w:abstractNumId="27" w15:restartNumberingAfterBreak="0">
     <w:nsid w:val="745107EB"/>
     <w:multiLevelType w:val="multilevel"/>
     <w:tmpl w:val="E976F550"/>
@@ -5538,7 +6172,7 @@
       </w:rPr>
     </w:lvl>
   </w:abstractNum>
-  <w:abstractNum w:abstractNumId="24" w15:restartNumberingAfterBreak="0">
+  <w:abstractNum w:abstractNumId="28" w15:restartNumberingAfterBreak="0">
     <w:nsid w:val="76C696AB"/>
     <w:multiLevelType w:val="hybridMultilevel"/>
     <w:tmpl w:val="E39EB3BE"/>
@@ -5651,7 +6285,7 @@
       </w:rPr>
     </w:lvl>
   </w:abstractNum>
-  <w:abstractNum w:abstractNumId="25" w15:restartNumberingAfterBreak="0">
+  <w:abstractNum w:abstractNumId="29" w15:restartNumberingAfterBreak="0">
     <w:nsid w:val="7A944ED8"/>
     <w:multiLevelType w:val="multilevel"/>
     <w:tmpl w:val="094CE3C2"/>
@@ -5801,82 +6435,94 @@
     </w:lvl>
   </w:abstractNum>
   <w:num w:numId="1" w16cid:durableId="116799051">
-    <w:abstractNumId w:val="13"/>
+    <w:abstractNumId w:val="17"/>
   </w:num>
   <w:num w:numId="2" w16cid:durableId="561252826">
+    <w:abstractNumId w:val="28"/>
+  </w:num>
+  <w:num w:numId="3" w16cid:durableId="338313333">
     <w:abstractNumId w:val="24"/>
   </w:num>
-  <w:num w:numId="3" w16cid:durableId="338313333">
+  <w:num w:numId="4" w16cid:durableId="1950356080">
     <w:abstractNumId w:val="20"/>
   </w:num>
-  <w:num w:numId="4" w16cid:durableId="1950356080">
-    <w:abstractNumId w:val="16"/>
-  </w:num>
   <w:num w:numId="5" w16cid:durableId="1744722099">
-    <w:abstractNumId w:val="6"/>
+    <w:abstractNumId w:val="7"/>
   </w:num>
   <w:num w:numId="6" w16cid:durableId="208690916">
-    <w:abstractNumId w:val="1"/>
+    <w:abstractNumId w:val="2"/>
   </w:num>
   <w:num w:numId="7" w16cid:durableId="1268081864">
-    <w:abstractNumId w:val="15"/>
+    <w:abstractNumId w:val="19"/>
   </w:num>
   <w:num w:numId="8" w16cid:durableId="407771350">
-    <w:abstractNumId w:val="2"/>
+    <w:abstractNumId w:val="3"/>
   </w:num>
   <w:num w:numId="9" w16cid:durableId="1219779350">
     <w:abstractNumId w:val="0"/>
   </w:num>
   <w:num w:numId="10" w16cid:durableId="1199510859">
+    <w:abstractNumId w:val="27"/>
+  </w:num>
+  <w:num w:numId="11" w16cid:durableId="604772017">
+    <w:abstractNumId w:val="15"/>
+  </w:num>
+  <w:num w:numId="12" w16cid:durableId="1995137075">
+    <w:abstractNumId w:val="11"/>
+  </w:num>
+  <w:num w:numId="13" w16cid:durableId="83427538">
+    <w:abstractNumId w:val="5"/>
+  </w:num>
+  <w:num w:numId="14" w16cid:durableId="791901432">
+    <w:abstractNumId w:val="8"/>
+  </w:num>
+  <w:num w:numId="15" w16cid:durableId="870268658">
+    <w:abstractNumId w:val="9"/>
+  </w:num>
+  <w:num w:numId="16" w16cid:durableId="41877922">
+    <w:abstractNumId w:val="16"/>
+  </w:num>
+  <w:num w:numId="17" w16cid:durableId="1529100238">
+    <w:abstractNumId w:val="21"/>
+  </w:num>
+  <w:num w:numId="18" w16cid:durableId="2086567699">
+    <w:abstractNumId w:val="18"/>
+  </w:num>
+  <w:num w:numId="19" w16cid:durableId="1787843520">
+    <w:abstractNumId w:val="4"/>
+  </w:num>
+  <w:num w:numId="20" w16cid:durableId="1515070887">
+    <w:abstractNumId w:val="13"/>
+  </w:num>
+  <w:num w:numId="21" w16cid:durableId="2034652601">
     <w:abstractNumId w:val="23"/>
   </w:num>
-  <w:num w:numId="11" w16cid:durableId="604772017">
-    <w:abstractNumId w:val="11"/>
+  <w:num w:numId="22" w16cid:durableId="1983463001">
+    <w:abstractNumId w:val="26"/>
   </w:num>
-  <w:num w:numId="12" w16cid:durableId="1995137075">
-    <w:abstractNumId w:val="9"/>
+  <w:num w:numId="23" w16cid:durableId="1701121314">
+    <w:abstractNumId w:val="6"/>
   </w:num>
-  <w:num w:numId="13" w16cid:durableId="83427538">
-    <w:abstractNumId w:val="4"/>
+  <w:num w:numId="24" w16cid:durableId="577401913">
+    <w:abstractNumId w:val="29"/>
   </w:num>
-  <w:num w:numId="14" w16cid:durableId="791901432">
-    <w:abstractNumId w:val="7"/>
+  <w:num w:numId="25" w16cid:durableId="1603760765">
+    <w:abstractNumId w:val="22"/>
   </w:num>
-  <w:num w:numId="15" w16cid:durableId="870268658">
-    <w:abstractNumId w:val="8"/>
+  <w:num w:numId="26" w16cid:durableId="1886141082">
+    <w:abstractNumId w:val="25"/>
   </w:num>
-  <w:num w:numId="16" w16cid:durableId="41877922">
+  <w:num w:numId="27" w16cid:durableId="1318261961">
+    <w:abstractNumId w:val="10"/>
+  </w:num>
+  <w:num w:numId="28" w16cid:durableId="1648052575">
+    <w:abstractNumId w:val="1"/>
+  </w:num>
+  <w:num w:numId="29" w16cid:durableId="1571885835">
     <w:abstractNumId w:val="12"/>
   </w:num>
-  <w:num w:numId="17" w16cid:durableId="1529100238">
-    <w:abstractNumId w:val="17"/>
-  </w:num>
-  <w:num w:numId="18" w16cid:durableId="2086567699">
+  <w:num w:numId="30" w16cid:durableId="2117094644">
     <w:abstractNumId w:val="14"/>
-  </w:num>
-  <w:num w:numId="19" w16cid:durableId="1787843520">
-    <w:abstractNumId w:val="3"/>
-  </w:num>
-  <w:num w:numId="20" w16cid:durableId="1515070887">
-    <w:abstractNumId w:val="10"/>
-  </w:num>
-  <w:num w:numId="21" w16cid:durableId="2034652601">
-    <w:abstractNumId w:val="19"/>
-  </w:num>
-  <w:num w:numId="22" w16cid:durableId="1983463001">
-    <w:abstractNumId w:val="22"/>
-  </w:num>
-  <w:num w:numId="23" w16cid:durableId="1701121314">
-    <w:abstractNumId w:val="5"/>
-  </w:num>
-  <w:num w:numId="24" w16cid:durableId="577401913">
-    <w:abstractNumId w:val="25"/>
-  </w:num>
-  <w:num w:numId="25" w16cid:durableId="1603760765">
-    <w:abstractNumId w:val="18"/>
-  </w:num>
-  <w:num w:numId="26" w16cid:durableId="1886141082">
-    <w:abstractNumId w:val="21"/>
   </w:num>
 </w:numbering>
 </file>

</xml_diff>